<commit_message>
chore: remove ENERGY SAVED line from styled equipment template too
Co-Authored-By: Claude Opus 4.8 <noreply@anthropic.com>
</commit_message>
<xml_diff>
--- a/EquipmentOfferTemplate_styled.docx
+++ b/EquipmentOfferTemplate_styled.docx
@@ -2726,7 +2726,6 @@
           <w:sz w:val="18"/>
           <w:szCs w:val="18"/>
         </w:rPr>
-        <w:t>ENERGY SAVED IS MONEY EARNED!!</w:t>
       </w:r>
     </w:p>
     <w:p>
@@ -8547,31 +8546,6 @@
           <w:t>www.encon.co.in</w:t>
         </w:r>
       </w:hyperlink>
-    </w:p>
-    <w:p>
-      <w:pPr>
-        <w:rPr>
-          <w:rFonts w:ascii="Arial" w:eastAsiaTheme="minorEastAsia" w:hAnsi="Arial" w:cs="Arial"/>
-          <w:b/>
-          <w:noProof/>
-          <w:color w:val="0000FF"/>
-          <w:sz w:val="20"/>
-          <w:szCs w:val="20"/>
-          <w:lang w:eastAsia="en-IN"/>
-        </w:rPr>
-      </w:pPr>
-      <w:r>
-        <w:rPr>
-          <w:rFonts w:ascii="Calibri" w:eastAsiaTheme="minorEastAsia" w:hAnsi="Calibri" w:cs="Calibri"/>
-          <w:b/>
-          <w:noProof/>
-          <w:color w:val="E87722"/>
-          <w:sz w:val="20"/>
-          <w:szCs w:val="20"/>
-          <w:lang w:eastAsia="en-IN"/>
-        </w:rPr>
-        <w:t>ENERGY SAVED IS MONEY EARNED!!</w:t>
-      </w:r>
     </w:p>
     <w:p>
       <w:pPr>

</xml_diff>